<commit_message>
two papers read: Moreno's look adopted for every figure, FireDX refused before the finals, and the knowledge base opens
- paper/style.py rewritten to the Moreno et al. (2025) rules (framed panels, panel letters,
  hairline bar edges, framed legends, fire/blue/grey palette, YlOrRd); F4-F7 lettered; F7 title
  moved into the panel; figures and docx regenerated (WFG-058 done)
- docs/auto/knowledge/: PYROGEOGRAPHY.md, ROUTING_FUNDAMENTALS.md, WUI_BUILDINGS_AS_FUEL.md
  (FireDX verdict: not before the freeze; WFG-059 post-finals), FIGURE_STYLE_REFERENCE.md, README
- CHARTER §13 and ROUTINE_PROMPTS research step 2b: the research routine extends the notes every run
- BACKLOG: WFG-058 done, WFG-059 (P3), WFG-060 (study-area map); rows renumbered after the
  cloud lap's WFG-053..057 landed mid-lap; board rebuilt over both laps

Co-Authored-By: Claude Fable 5.1 <noreply@anthropic.com>
</commit_message>
<xml_diff>
--- a/paper/WildfireGuardian_Park_2026.docx
+++ b/paper/WildfireGuardian_Park_2026.docx
@@ -709,7 +709,7 @@
       <w:r>
         <w:drawing>
           <wp:inline xmlns:a="http://schemas.openxmlformats.org/drawingml/2006/main" xmlns:pic="http://schemas.openxmlformats.org/drawingml/2006/picture">
-            <wp:extent cx="5760000" cy="2803515"/>
+            <wp:extent cx="5760000" cy="2819264"/>
             <wp:docPr id="2" name="Picture 2"/>
             <wp:cNvGraphicFramePr>
               <a:graphicFrameLocks noChangeAspect="1"/>
@@ -730,7 +730,7 @@
                   <pic:spPr>
                     <a:xfrm>
                       <a:off x="0" y="0"/>
-                      <a:ext cx="5760000" cy="2803515"/>
+                      <a:ext cx="5760000" cy="2819264"/>
                     </a:xfrm>
                     <a:prstGeom prst="rect"/>
                   </pic:spPr>
@@ -1209,7 +1209,7 @@
       <w:r>
         <w:drawing>
           <wp:inline xmlns:a="http://schemas.openxmlformats.org/drawingml/2006/main" xmlns:pic="http://schemas.openxmlformats.org/drawingml/2006/picture">
-            <wp:extent cx="5760000" cy="2524739"/>
+            <wp:extent cx="5760000" cy="2531590"/>
             <wp:docPr id="3" name="Picture 3"/>
             <wp:cNvGraphicFramePr>
               <a:graphicFrameLocks noChangeAspect="1"/>
@@ -1230,7 +1230,7 @@
                   <pic:spPr>
                     <a:xfrm>
                       <a:off x="0" y="0"/>
-                      <a:ext cx="5760000" cy="2524739"/>
+                      <a:ext cx="5760000" cy="2531590"/>
                     </a:xfrm>
                     <a:prstGeom prst="rect"/>
                   </pic:spPr>
@@ -1309,7 +1309,7 @@
       <w:r>
         <w:drawing>
           <wp:inline xmlns:a="http://schemas.openxmlformats.org/drawingml/2006/main" xmlns:pic="http://schemas.openxmlformats.org/drawingml/2006/picture">
-            <wp:extent cx="5760000" cy="2085614"/>
+            <wp:extent cx="5760000" cy="2140312"/>
             <wp:docPr id="4" name="Picture 4"/>
             <wp:cNvGraphicFramePr>
               <a:graphicFrameLocks noChangeAspect="1"/>
@@ -1330,7 +1330,7 @@
                   <pic:spPr>
                     <a:xfrm>
                       <a:off x="0" y="0"/>
-                      <a:ext cx="5760000" cy="2085614"/>
+                      <a:ext cx="5760000" cy="2140312"/>
                     </a:xfrm>
                     <a:prstGeom prst="rect"/>
                   </pic:spPr>
@@ -1402,7 +1402,7 @@
       <w:r>
         <w:drawing>
           <wp:inline xmlns:a="http://schemas.openxmlformats.org/drawingml/2006/main" xmlns:pic="http://schemas.openxmlformats.org/drawingml/2006/picture">
-            <wp:extent cx="5760000" cy="2698467"/>
+            <wp:extent cx="5760000" cy="2747077"/>
             <wp:docPr id="5" name="Picture 5"/>
             <wp:cNvGraphicFramePr>
               <a:graphicFrameLocks noChangeAspect="1"/>
@@ -1423,7 +1423,7 @@
                   <pic:spPr>
                     <a:xfrm>
                       <a:off x="0" y="0"/>
-                      <a:ext cx="5760000" cy="2698467"/>
+                      <a:ext cx="5760000" cy="2747077"/>
                     </a:xfrm>
                     <a:prstGeom prst="rect"/>
                   </pic:spPr>
@@ -2427,7 +2427,7 @@
       <w:r>
         <w:drawing>
           <wp:inline xmlns:a="http://schemas.openxmlformats.org/drawingml/2006/main" xmlns:pic="http://schemas.openxmlformats.org/drawingml/2006/picture">
-            <wp:extent cx="5760000" cy="2266368"/>
+            <wp:extent cx="5760000" cy="2288760"/>
             <wp:docPr id="6" name="Picture 6"/>
             <wp:cNvGraphicFramePr>
               <a:graphicFrameLocks noChangeAspect="1"/>
@@ -2448,7 +2448,7 @@
                   <pic:spPr>
                     <a:xfrm>
                       <a:off x="0" y="0"/>
-                      <a:ext cx="5760000" cy="2266368"/>
+                      <a:ext cx="5760000" cy="2288760"/>
                     </a:xfrm>
                     <a:prstGeom prst="rect"/>
                   </pic:spPr>
@@ -2595,7 +2595,7 @@
       <w:r>
         <w:drawing>
           <wp:inline xmlns:a="http://schemas.openxmlformats.org/drawingml/2006/main" xmlns:pic="http://schemas.openxmlformats.org/drawingml/2006/picture">
-            <wp:extent cx="5760000" cy="2213450"/>
+            <wp:extent cx="5760000" cy="2231224"/>
             <wp:docPr id="7" name="Picture 7"/>
             <wp:cNvGraphicFramePr>
               <a:graphicFrameLocks noChangeAspect="1"/>
@@ -2616,7 +2616,7 @@
                   <pic:spPr>
                     <a:xfrm>
                       <a:off x="0" y="0"/>
-                      <a:ext cx="5760000" cy="2213450"/>
+                      <a:ext cx="5760000" cy="2231224"/>
                     </a:xfrm>
                     <a:prstGeom prst="rect"/>
                   </pic:spPr>

</xml_diff>

<commit_message>
F8: the canonical Yeongdeok case as a routing map in the Moreno look, cited in the manuscript (WFG-060 first half)
Hillshade, YlOrRd forecast field, 0.5 isolines, walk network, refuges, all 458 scanned origins
classed, three example origins with fire-blind vs forecast-aware routes; offline from committed
snapshots; routes recomputed with the repository router and matching the committed partition.
Six-fire study-area map recorded as blocked. Docx rebuilt.

Co-Authored-By: Claude Fable 5.1 <noreply@anthropic.com>
</commit_message>
<xml_diff>
--- a/paper/WildfireGuardian_Park_2026.docx
+++ b/paper/WildfireGuardian_Park_2026.docx
@@ -1366,6 +1366,63 @@
       </w:r>
     </w:p>
     <w:p>
+      <w:pPr>
+        <w:jc w:val="center"/>
+      </w:pPr>
+      <w:r>
+        <w:drawing>
+          <wp:inline xmlns:a="http://schemas.openxmlformats.org/drawingml/2006/main" xmlns:pic="http://schemas.openxmlformats.org/drawingml/2006/picture">
+            <wp:extent cx="5760000" cy="3535842"/>
+            <wp:docPr id="5" name="Picture 5"/>
+            <wp:cNvGraphicFramePr>
+              <a:graphicFrameLocks noChangeAspect="1"/>
+            </wp:cNvGraphicFramePr>
+            <a:graphic>
+              <a:graphicData uri="http://schemas.openxmlformats.org/drawingml/2006/picture">
+                <pic:pic>
+                  <pic:nvPicPr>
+                    <pic:cNvPr id="0" name="F8_routing_map.png"/>
+                    <pic:cNvPicPr/>
+                  </pic:nvPicPr>
+                  <pic:blipFill>
+                    <a:blip r:embed="rId13"/>
+                    <a:stretch>
+                      <a:fillRect/>
+                    </a:stretch>
+                  </pic:blipFill>
+                  <pic:spPr>
+                    <a:xfrm>
+                      <a:off x="0" y="0"/>
+                      <a:ext cx="5760000" cy="3535842"/>
+                    </a:xfrm>
+                    <a:prstGeom prst="rect"/>
+                  </pic:spPr>
+                </pic:pic>
+              </a:graphicData>
+            </a:graphic>
+          </wp:inline>
+        </w:drawing>
+      </w:r>
+    </w:p>
+    <w:p>
+      <w:pPr>
+        <w:jc w:val="center"/>
+      </w:pPr>
+      <w:r>
+        <w:rPr>
+          <w:b/>
+          <w:sz w:val="19"/>
+        </w:rPr>
+        <w:t xml:space="preserve">Figure 5. </w:t>
+      </w:r>
+      <w:r>
+        <w:rPr>
+          <w:sz w:val="19"/>
+        </w:rPr>
+        <w:t>The canonical Yeongdeok 2025 case on the SRTM hillshade. (a) Forecast P(ignite) at 720 min, the cells at P ≥ 0.5 at 0 min (teal), the 720-min 0.5 isoline (dashed), the reported ignition (star); the rectangle is the walk-network extent. (b) The walk network, the refuge nodes snapped from 50 OSM points of interest (triangles), all 458 scanned origins classed as in the committed artifact (414 safe on both routes, 42 safe only on the forecast-aware route, 2 with no safe walking route), and three example origins with the fire-blind shortest route (grey, dashed) against the forecast-aware route (red). Routes are recomputed at figure time with the repository's own router from the committed snapshots, and the recomputed partition equals the committed one; the isoline is drawn on a one-cell smoothing of the slice for display only.</w:t>
+      </w:r>
+    </w:p>
+    <w:p>
       <w:r>
         <w:t xml:space="preserve">Two caveats are inseparable from those counts. </w:t>
       </w:r>
@@ -1409,7 +1466,7 @@
         <w:drawing>
           <wp:inline xmlns:a="http://schemas.openxmlformats.org/drawingml/2006/main" xmlns:pic="http://schemas.openxmlformats.org/drawingml/2006/picture">
             <wp:extent cx="5760000" cy="2681125"/>
-            <wp:docPr id="5" name="Picture 5"/>
+            <wp:docPr id="6" name="Picture 6"/>
             <wp:cNvGraphicFramePr>
               <a:graphicFrameLocks noChangeAspect="1"/>
             </wp:cNvGraphicFramePr>
@@ -1421,7 +1478,7 @@
                     <pic:cNvPicPr/>
                   </pic:nvPicPr>
                   <pic:blipFill>
-                    <a:blip r:embed="rId13"/>
+                    <a:blip r:embed="rId14"/>
                     <a:stretch>
                       <a:fillRect/>
                     </a:stretch>
@@ -1449,7 +1506,7 @@
           <w:b/>
           <w:sz w:val="19"/>
         </w:rPr>
-        <w:t xml:space="preserve">Figure 5. </w:t>
+        <w:t xml:space="preserve">Figure 6. </w:t>
       </w:r>
       <w:r>
         <w:rPr>
@@ -2434,7 +2491,7 @@
         <w:drawing>
           <wp:inline xmlns:a="http://schemas.openxmlformats.org/drawingml/2006/main" xmlns:pic="http://schemas.openxmlformats.org/drawingml/2006/picture">
             <wp:extent cx="5760000" cy="2270283"/>
-            <wp:docPr id="6" name="Picture 6"/>
+            <wp:docPr id="7" name="Picture 7"/>
             <wp:cNvGraphicFramePr>
               <a:graphicFrameLocks noChangeAspect="1"/>
             </wp:cNvGraphicFramePr>
@@ -2446,7 +2503,7 @@
                     <pic:cNvPicPr/>
                   </pic:nvPicPr>
                   <pic:blipFill>
-                    <a:blip r:embed="rId14"/>
+                    <a:blip r:embed="rId15"/>
                     <a:stretch>
                       <a:fillRect/>
                     </a:stretch>
@@ -2474,7 +2531,7 @@
           <w:b/>
           <w:sz w:val="19"/>
         </w:rPr>
-        <w:t xml:space="preserve">Figure 6. </w:t>
+        <w:t xml:space="preserve">Figure 7. </w:t>
       </w:r>
       <w:r>
         <w:rPr>
@@ -2602,7 +2659,7 @@
         <w:drawing>
           <wp:inline xmlns:a="http://schemas.openxmlformats.org/drawingml/2006/main" xmlns:pic="http://schemas.openxmlformats.org/drawingml/2006/picture">
             <wp:extent cx="5760000" cy="2296797"/>
-            <wp:docPr id="7" name="Picture 7"/>
+            <wp:docPr id="8" name="Picture 8"/>
             <wp:cNvGraphicFramePr>
               <a:graphicFrameLocks noChangeAspect="1"/>
             </wp:cNvGraphicFramePr>
@@ -2614,7 +2671,7 @@
                     <pic:cNvPicPr/>
                   </pic:nvPicPr>
                   <pic:blipFill>
-                    <a:blip r:embed="rId15"/>
+                    <a:blip r:embed="rId16"/>
                     <a:stretch>
                       <a:fillRect/>
                     </a:stretch>
@@ -2642,7 +2699,7 @@
           <w:b/>
           <w:sz w:val="19"/>
         </w:rPr>
-        <w:t xml:space="preserve">Figure 7. </w:t>
+        <w:t xml:space="preserve">Figure 8. </w:t>
       </w:r>
       <w:r>
         <w:rPr>

</xml_diff>